<commit_message>
Ten-seed statistics for both yards; correct earlier ten-seed numbers that mixed two detectors
Co-Authored-By: Claude Sonnet 5.5 <noreply@anthropic.com>
</commit_message>
<xml_diff>
--- a/drone-sim-today/UW-TIG_Project_Work_Report_final.docx
+++ b/drone-sim-today/UW-TIG_Project_Work_Report_final.docx
@@ -2800,7 +2800,7 @@
           <w:r>
             <w:fldChar w:fldCharType="separate"/>
           </w:r>
-          <w:hyperlink w:anchor="_Toc244268230" w:history="1">
+          <w:hyperlink w:anchor="_Toc244356147" w:history="1">
             <w:r>
               <w:rPr>
                 <w:rStyle w:val="Hyperlink"/>
@@ -2847,7 +2847,7 @@
                 <w:noProof/>
                 <w:webHidden/>
               </w:rPr>
-              <w:instrText xml:space="preserve"> PAGEREF _Toc244268230 \h </w:instrText>
+              <w:instrText xml:space="preserve"> PAGEREF _Toc244356147 \h </w:instrText>
             </w:r>
             <w:r>
               <w:rPr>
@@ -2893,7 +2893,7 @@
               <w:lang w:val="en-IN" w:eastAsia="en-IN"/>
             </w:rPr>
           </w:pPr>
-          <w:hyperlink w:anchor="_Toc244268231" w:history="1">
+          <w:hyperlink w:anchor="_Toc244356148" w:history="1">
             <w:r>
               <w:rPr>
                 <w:rStyle w:val="Hyperlink"/>
@@ -2938,7 +2938,7 @@
                 <w:noProof/>
                 <w:webHidden/>
               </w:rPr>
-              <w:instrText xml:space="preserve"> PAGEREF _Toc244268231 \h </w:instrText>
+              <w:instrText xml:space="preserve"> PAGEREF _Toc244356148 \h </w:instrText>
             </w:r>
             <w:r>
               <w:rPr>
@@ -2984,7 +2984,7 @@
               <w:lang w:val="en-IN" w:eastAsia="en-IN"/>
             </w:rPr>
           </w:pPr>
-          <w:hyperlink w:anchor="_Toc244268232" w:history="1">
+          <w:hyperlink w:anchor="_Toc244356149" w:history="1">
             <w:r>
               <w:rPr>
                 <w:rStyle w:val="Hyperlink"/>
@@ -3029,7 +3029,7 @@
                 <w:noProof/>
                 <w:webHidden/>
               </w:rPr>
-              <w:instrText xml:space="preserve"> PAGEREF _Toc244268232 \h </w:instrText>
+              <w:instrText xml:space="preserve"> PAGEREF _Toc244356149 \h </w:instrText>
             </w:r>
             <w:r>
               <w:rPr>
@@ -3075,7 +3075,7 @@
               <w:lang w:val="en-IN" w:eastAsia="en-IN"/>
             </w:rPr>
           </w:pPr>
-          <w:hyperlink w:anchor="_Toc244268233" w:history="1">
+          <w:hyperlink w:anchor="_Toc244356150" w:history="1">
             <w:r>
               <w:rPr>
                 <w:rStyle w:val="Hyperlink"/>
@@ -3120,7 +3120,7 @@
                 <w:noProof/>
                 <w:webHidden/>
               </w:rPr>
-              <w:instrText xml:space="preserve"> PAGEREF _Toc244268233 \h </w:instrText>
+              <w:instrText xml:space="preserve"> PAGEREF _Toc244356150 \h </w:instrText>
             </w:r>
             <w:r>
               <w:rPr>
@@ -3168,7 +3168,7 @@
               <w:lang w:val="en-IN" w:eastAsia="en-IN"/>
             </w:rPr>
           </w:pPr>
-          <w:hyperlink w:anchor="_Toc244268234" w:history="1">
+          <w:hyperlink w:anchor="_Toc244356151" w:history="1">
             <w:r>
               <w:rPr>
                 <w:rStyle w:val="Hyperlink"/>
@@ -3230,7 +3230,7 @@
                 <w:noProof/>
                 <w:webHidden/>
               </w:rPr>
-              <w:instrText xml:space="preserve"> PAGEREF _Toc244268234 \h </w:instrText>
+              <w:instrText xml:space="preserve"> PAGEREF _Toc244356151 \h </w:instrText>
             </w:r>
             <w:r>
               <w:rPr>
@@ -3276,7 +3276,7 @@
               <w:lang w:val="en-IN" w:eastAsia="en-IN"/>
             </w:rPr>
           </w:pPr>
-          <w:hyperlink w:anchor="_Toc244268235" w:history="1">
+          <w:hyperlink w:anchor="_Toc244356152" w:history="1">
             <w:r>
               <w:rPr>
                 <w:rStyle w:val="Hyperlink"/>
@@ -3336,7 +3336,7 @@
                 <w:noProof/>
                 <w:webHidden/>
               </w:rPr>
-              <w:instrText xml:space="preserve"> PAGEREF _Toc244268235 \h </w:instrText>
+              <w:instrText xml:space="preserve"> PAGEREF _Toc244356152 \h </w:instrText>
             </w:r>
             <w:r>
               <w:rPr>
@@ -3382,7 +3382,7 @@
               <w:lang w:val="en-IN" w:eastAsia="en-IN"/>
             </w:rPr>
           </w:pPr>
-          <w:hyperlink w:anchor="_Toc244268236" w:history="1">
+          <w:hyperlink w:anchor="_Toc244356153" w:history="1">
             <w:r>
               <w:rPr>
                 <w:rStyle w:val="Hyperlink"/>
@@ -3427,7 +3427,7 @@
                 <w:noProof/>
                 <w:webHidden/>
               </w:rPr>
-              <w:instrText xml:space="preserve"> PAGEREF _Toc244268236 \h </w:instrText>
+              <w:instrText xml:space="preserve"> PAGEREF _Toc244356153 \h </w:instrText>
             </w:r>
             <w:r>
               <w:rPr>
@@ -3473,7 +3473,7 @@
               <w:lang w:val="en-IN" w:eastAsia="en-IN"/>
             </w:rPr>
           </w:pPr>
-          <w:hyperlink w:anchor="_Toc244268237" w:history="1">
+          <w:hyperlink w:anchor="_Toc244356154" w:history="1">
             <w:r>
               <w:rPr>
                 <w:rStyle w:val="Hyperlink"/>
@@ -3533,7 +3533,7 @@
                 <w:noProof/>
                 <w:webHidden/>
               </w:rPr>
-              <w:instrText xml:space="preserve"> PAGEREF _Toc244268237 \h </w:instrText>
+              <w:instrText xml:space="preserve"> PAGEREF _Toc244356154 \h </w:instrText>
             </w:r>
             <w:r>
               <w:rPr>
@@ -3579,7 +3579,7 @@
               <w:lang w:val="en-IN" w:eastAsia="en-IN"/>
             </w:rPr>
           </w:pPr>
-          <w:hyperlink w:anchor="_Toc244268238" w:history="1">
+          <w:hyperlink w:anchor="_Toc244356155" w:history="1">
             <w:r>
               <w:rPr>
                 <w:rStyle w:val="Hyperlink"/>
@@ -3639,7 +3639,7 @@
                 <w:noProof/>
                 <w:webHidden/>
               </w:rPr>
-              <w:instrText xml:space="preserve"> PAGEREF _Toc244268238 \h </w:instrText>
+              <w:instrText xml:space="preserve"> PAGEREF _Toc244356155 \h </w:instrText>
             </w:r>
             <w:r>
               <w:rPr>
@@ -3687,7 +3687,7 @@
               <w:lang w:val="en-IN" w:eastAsia="en-IN"/>
             </w:rPr>
           </w:pPr>
-          <w:hyperlink w:anchor="_Toc244268239" w:history="1">
+          <w:hyperlink w:anchor="_Toc244356156" w:history="1">
             <w:r>
               <w:rPr>
                 <w:rStyle w:val="Hyperlink"/>
@@ -3749,7 +3749,7 @@
                 <w:noProof/>
                 <w:webHidden/>
               </w:rPr>
-              <w:instrText xml:space="preserve"> PAGEREF _Toc244268239 \h </w:instrText>
+              <w:instrText xml:space="preserve"> PAGEREF _Toc244356156 \h </w:instrText>
             </w:r>
             <w:r>
               <w:rPr>
@@ -3795,7 +3795,7 @@
               <w:lang w:val="en-IN" w:eastAsia="en-IN"/>
             </w:rPr>
           </w:pPr>
-          <w:hyperlink w:anchor="_Toc244268240" w:history="1">
+          <w:hyperlink w:anchor="_Toc244356157" w:history="1">
             <w:r>
               <w:rPr>
                 <w:rStyle w:val="Hyperlink"/>
@@ -3855,7 +3855,7 @@
                 <w:noProof/>
                 <w:webHidden/>
               </w:rPr>
-              <w:instrText xml:space="preserve"> PAGEREF _Toc244268240 \h </w:instrText>
+              <w:instrText xml:space="preserve"> PAGEREF _Toc244356157 \h </w:instrText>
             </w:r>
             <w:r>
               <w:rPr>
@@ -3901,7 +3901,7 @@
               <w:lang w:val="en-IN" w:eastAsia="en-IN"/>
             </w:rPr>
           </w:pPr>
-          <w:hyperlink w:anchor="_Toc244268241" w:history="1">
+          <w:hyperlink w:anchor="_Toc244356158" w:history="1">
             <w:r>
               <w:rPr>
                 <w:rStyle w:val="Hyperlink"/>
@@ -3961,7 +3961,7 @@
                 <w:noProof/>
                 <w:webHidden/>
               </w:rPr>
-              <w:instrText xml:space="preserve"> PAGEREF _Toc244268241 \h </w:instrText>
+              <w:instrText xml:space="preserve"> PAGEREF _Toc244356158 \h </w:instrText>
             </w:r>
             <w:r>
               <w:rPr>
@@ -4007,7 +4007,7 @@
               <w:lang w:val="en-IN" w:eastAsia="en-IN"/>
             </w:rPr>
           </w:pPr>
-          <w:hyperlink w:anchor="_Toc244268242" w:history="1">
+          <w:hyperlink w:anchor="_Toc244356159" w:history="1">
             <w:r>
               <w:rPr>
                 <w:rStyle w:val="Hyperlink"/>
@@ -4052,7 +4052,7 @@
                 <w:noProof/>
                 <w:webHidden/>
               </w:rPr>
-              <w:instrText xml:space="preserve"> PAGEREF _Toc244268242 \h </w:instrText>
+              <w:instrText xml:space="preserve"> PAGEREF _Toc244356159 \h </w:instrText>
             </w:r>
             <w:r>
               <w:rPr>
@@ -4100,7 +4100,7 @@
               <w:lang w:val="en-IN" w:eastAsia="en-IN"/>
             </w:rPr>
           </w:pPr>
-          <w:hyperlink w:anchor="_Toc244268243" w:history="1">
+          <w:hyperlink w:anchor="_Toc244356160" w:history="1">
             <w:r>
               <w:rPr>
                 <w:rStyle w:val="Hyperlink"/>
@@ -4162,7 +4162,7 @@
                 <w:noProof/>
                 <w:webHidden/>
               </w:rPr>
-              <w:instrText xml:space="preserve"> PAGEREF _Toc244268243 \h </w:instrText>
+              <w:instrText xml:space="preserve"> PAGEREF _Toc244356160 \h </w:instrText>
             </w:r>
             <w:r>
               <w:rPr>
@@ -4208,7 +4208,7 @@
               <w:lang w:val="en-IN" w:eastAsia="en-IN"/>
             </w:rPr>
           </w:pPr>
-          <w:hyperlink w:anchor="_Toc244268244" w:history="1">
+          <w:hyperlink w:anchor="_Toc244356161" w:history="1">
             <w:r>
               <w:rPr>
                 <w:rStyle w:val="Hyperlink"/>
@@ -4268,7 +4268,7 @@
                 <w:noProof/>
                 <w:webHidden/>
               </w:rPr>
-              <w:instrText xml:space="preserve"> PAGEREF _Toc244268244 \h </w:instrText>
+              <w:instrText xml:space="preserve"> PAGEREF _Toc244356161 \h </w:instrText>
             </w:r>
             <w:r>
               <w:rPr>
@@ -4314,7 +4314,7 @@
               <w:lang w:val="en-IN" w:eastAsia="en-IN"/>
             </w:rPr>
           </w:pPr>
-          <w:hyperlink w:anchor="_Toc244268245" w:history="1">
+          <w:hyperlink w:anchor="_Toc244356162" w:history="1">
             <w:r>
               <w:rPr>
                 <w:rStyle w:val="Hyperlink"/>
@@ -4374,7 +4374,7 @@
                 <w:noProof/>
                 <w:webHidden/>
               </w:rPr>
-              <w:instrText xml:space="preserve"> PAGEREF _Toc244268245 \h </w:instrText>
+              <w:instrText xml:space="preserve"> PAGEREF _Toc244356162 \h </w:instrText>
             </w:r>
             <w:r>
               <w:rPr>
@@ -4420,7 +4420,7 @@
               <w:lang w:val="en-IN" w:eastAsia="en-IN"/>
             </w:rPr>
           </w:pPr>
-          <w:hyperlink w:anchor="_Toc244268246" w:history="1">
+          <w:hyperlink w:anchor="_Toc244356163" w:history="1">
             <w:r>
               <w:rPr>
                 <w:rStyle w:val="Hyperlink"/>
@@ -4495,7 +4495,7 @@
                 <w:noProof/>
                 <w:webHidden/>
               </w:rPr>
-              <w:instrText xml:space="preserve"> PAGEREF _Toc244268246 \h </w:instrText>
+              <w:instrText xml:space="preserve"> PAGEREF _Toc244356163 \h </w:instrText>
             </w:r>
             <w:r>
               <w:rPr>
@@ -4541,7 +4541,7 @@
               <w:lang w:val="en-IN" w:eastAsia="en-IN"/>
             </w:rPr>
           </w:pPr>
-          <w:hyperlink w:anchor="_Toc244268247" w:history="1">
+          <w:hyperlink w:anchor="_Toc244356164" w:history="1">
             <w:r>
               <w:rPr>
                 <w:rStyle w:val="Hyperlink"/>
@@ -4616,7 +4616,7 @@
                 <w:noProof/>
                 <w:webHidden/>
               </w:rPr>
-              <w:instrText xml:space="preserve"> PAGEREF _Toc244268247 \h </w:instrText>
+              <w:instrText xml:space="preserve"> PAGEREF _Toc244356164 \h </w:instrText>
             </w:r>
             <w:r>
               <w:rPr>
@@ -4662,7 +4662,7 @@
               <w:lang w:val="en-IN" w:eastAsia="en-IN"/>
             </w:rPr>
           </w:pPr>
-          <w:hyperlink w:anchor="_Toc244268248" w:history="1">
+          <w:hyperlink w:anchor="_Toc244356165" w:history="1">
             <w:r>
               <w:rPr>
                 <w:rStyle w:val="Hyperlink"/>
@@ -4707,7 +4707,7 @@
                 <w:noProof/>
                 <w:webHidden/>
               </w:rPr>
-              <w:instrText xml:space="preserve"> PAGEREF _Toc244268248 \h </w:instrText>
+              <w:instrText xml:space="preserve"> PAGEREF _Toc244356165 \h </w:instrText>
             </w:r>
             <w:r>
               <w:rPr>
@@ -4753,7 +4753,7 @@
               <w:lang w:val="en-IN" w:eastAsia="en-IN"/>
             </w:rPr>
           </w:pPr>
-          <w:hyperlink w:anchor="_Toc244268249" w:history="1">
+          <w:hyperlink w:anchor="_Toc244356166" w:history="1">
             <w:r>
               <w:rPr>
                 <w:rStyle w:val="Hyperlink"/>
@@ -4798,7 +4798,7 @@
                 <w:noProof/>
                 <w:webHidden/>
               </w:rPr>
-              <w:instrText xml:space="preserve"> PAGEREF _Toc244268249 \h </w:instrText>
+              <w:instrText xml:space="preserve"> PAGEREF _Toc244356166 \h </w:instrText>
             </w:r>
             <w:r>
               <w:rPr>
@@ -4844,7 +4844,7 @@
               <w:lang w:val="en-IN" w:eastAsia="en-IN"/>
             </w:rPr>
           </w:pPr>
-          <w:hyperlink w:anchor="_Toc244268250" w:history="1">
+          <w:hyperlink w:anchor="_Toc244356167" w:history="1">
             <w:r>
               <w:rPr>
                 <w:rStyle w:val="Hyperlink"/>
@@ -4904,7 +4904,7 @@
                 <w:noProof/>
                 <w:webHidden/>
               </w:rPr>
-              <w:instrText xml:space="preserve"> PAGEREF _Toc244268250 \h </w:instrText>
+              <w:instrText xml:space="preserve"> PAGEREF _Toc244356167 \h </w:instrText>
             </w:r>
             <w:r>
               <w:rPr>
@@ -4950,7 +4950,7 @@
               <w:lang w:val="en-IN" w:eastAsia="en-IN"/>
             </w:rPr>
           </w:pPr>
-          <w:hyperlink w:anchor="_Toc244268251" w:history="1">
+          <w:hyperlink w:anchor="_Toc244356168" w:history="1">
             <w:r>
               <w:rPr>
                 <w:rStyle w:val="Hyperlink"/>
@@ -5025,7 +5025,7 @@
                 <w:noProof/>
                 <w:webHidden/>
               </w:rPr>
-              <w:instrText xml:space="preserve"> PAGEREF _Toc244268251 \h </w:instrText>
+              <w:instrText xml:space="preserve"> PAGEREF _Toc244356168 \h </w:instrText>
             </w:r>
             <w:r>
               <w:rPr>
@@ -5071,7 +5071,7 @@
               <w:lang w:val="en-IN" w:eastAsia="en-IN"/>
             </w:rPr>
           </w:pPr>
-          <w:hyperlink w:anchor="_Toc244268252" w:history="1">
+          <w:hyperlink w:anchor="_Toc244356169" w:history="1">
             <w:r>
               <w:rPr>
                 <w:rStyle w:val="Hyperlink"/>
@@ -5146,7 +5146,7 @@
                 <w:noProof/>
                 <w:webHidden/>
               </w:rPr>
-              <w:instrText xml:space="preserve"> PAGEREF _Toc244268252 \h </w:instrText>
+              <w:instrText xml:space="preserve"> PAGEREF _Toc244356169 \h </w:instrText>
             </w:r>
             <w:r>
               <w:rPr>
@@ -5192,7 +5192,7 @@
               <w:lang w:val="en-IN" w:eastAsia="en-IN"/>
             </w:rPr>
           </w:pPr>
-          <w:hyperlink w:anchor="_Toc244268253" w:history="1">
+          <w:hyperlink w:anchor="_Toc244356170" w:history="1">
             <w:r>
               <w:rPr>
                 <w:rStyle w:val="Hyperlink"/>
@@ -5282,7 +5282,7 @@
                 <w:noProof/>
                 <w:webHidden/>
               </w:rPr>
-              <w:instrText xml:space="preserve"> PAGEREF _Toc244268253 \h </w:instrText>
+              <w:instrText xml:space="preserve"> PAGEREF _Toc244356170 \h </w:instrText>
             </w:r>
             <w:r>
               <w:rPr>
@@ -5328,7 +5328,7 @@
               <w:lang w:val="en-IN" w:eastAsia="en-IN"/>
             </w:rPr>
           </w:pPr>
-          <w:hyperlink w:anchor="_Toc244268254" w:history="1">
+          <w:hyperlink w:anchor="_Toc244356171" w:history="1">
             <w:r>
               <w:rPr>
                 <w:rStyle w:val="Hyperlink"/>
@@ -5388,7 +5388,7 @@
                 <w:noProof/>
                 <w:webHidden/>
               </w:rPr>
-              <w:instrText xml:space="preserve"> PAGEREF _Toc244268254 \h </w:instrText>
+              <w:instrText xml:space="preserve"> PAGEREF _Toc244356171 \h </w:instrText>
             </w:r>
             <w:r>
               <w:rPr>
@@ -5434,7 +5434,7 @@
               <w:lang w:val="en-IN" w:eastAsia="en-IN"/>
             </w:rPr>
           </w:pPr>
-          <w:hyperlink w:anchor="_Toc244268255" w:history="1">
+          <w:hyperlink w:anchor="_Toc244356172" w:history="1">
             <w:r>
               <w:rPr>
                 <w:rStyle w:val="Hyperlink"/>
@@ -5569,7 +5569,7 @@
                 <w:noProof/>
                 <w:webHidden/>
               </w:rPr>
-              <w:instrText xml:space="preserve"> PAGEREF _Toc244268255 \h </w:instrText>
+              <w:instrText xml:space="preserve"> PAGEREF _Toc244356172 \h </w:instrText>
             </w:r>
             <w:r>
               <w:rPr>
@@ -5617,7 +5617,7 @@
               <w:lang w:val="en-IN" w:eastAsia="en-IN"/>
             </w:rPr>
           </w:pPr>
-          <w:hyperlink w:anchor="_Toc244268256" w:history="1">
+          <w:hyperlink w:anchor="_Toc244356173" w:history="1">
             <w:r>
               <w:rPr>
                 <w:rStyle w:val="Hyperlink"/>
@@ -5679,7 +5679,7 @@
                 <w:noProof/>
                 <w:webHidden/>
               </w:rPr>
-              <w:instrText xml:space="preserve"> PAGEREF _Toc244268256 \h </w:instrText>
+              <w:instrText xml:space="preserve"> PAGEREF _Toc244356173 \h </w:instrText>
             </w:r>
             <w:r>
               <w:rPr>
@@ -5725,7 +5725,7 @@
               <w:lang w:val="en-IN" w:eastAsia="en-IN"/>
             </w:rPr>
           </w:pPr>
-          <w:hyperlink w:anchor="_Toc244268257" w:history="1">
+          <w:hyperlink w:anchor="_Toc244356174" w:history="1">
             <w:r>
               <w:rPr>
                 <w:rStyle w:val="Hyperlink"/>
@@ -5785,7 +5785,7 @@
                 <w:noProof/>
                 <w:webHidden/>
               </w:rPr>
-              <w:instrText xml:space="preserve"> PAGEREF _Toc244268257 \h </w:instrText>
+              <w:instrText xml:space="preserve"> PAGEREF _Toc244356174 \h </w:instrText>
             </w:r>
             <w:r>
               <w:rPr>
@@ -5831,7 +5831,7 @@
               <w:lang w:val="en-IN" w:eastAsia="en-IN"/>
             </w:rPr>
           </w:pPr>
-          <w:hyperlink w:anchor="_Toc244268258" w:history="1">
+          <w:hyperlink w:anchor="_Toc244356175" w:history="1">
             <w:r>
               <w:rPr>
                 <w:rStyle w:val="Hyperlink"/>
@@ -5906,7 +5906,7 @@
                 <w:noProof/>
                 <w:webHidden/>
               </w:rPr>
-              <w:instrText xml:space="preserve"> PAGEREF _Toc244268258 \h </w:instrText>
+              <w:instrText xml:space="preserve"> PAGEREF _Toc244356175 \h </w:instrText>
             </w:r>
             <w:r>
               <w:rPr>
@@ -5952,7 +5952,7 @@
               <w:lang w:val="en-IN" w:eastAsia="en-IN"/>
             </w:rPr>
           </w:pPr>
-          <w:hyperlink w:anchor="_Toc244268259" w:history="1">
+          <w:hyperlink w:anchor="_Toc244356176" w:history="1">
             <w:r>
               <w:rPr>
                 <w:rStyle w:val="Hyperlink"/>
@@ -6027,7 +6027,7 @@
                 <w:noProof/>
                 <w:webHidden/>
               </w:rPr>
-              <w:instrText xml:space="preserve"> PAGEREF _Toc244268259 \h </w:instrText>
+              <w:instrText xml:space="preserve"> PAGEREF _Toc244356176 \h </w:instrText>
             </w:r>
             <w:r>
               <w:rPr>
@@ -6073,7 +6073,7 @@
               <w:lang w:val="en-IN" w:eastAsia="en-IN"/>
             </w:rPr>
           </w:pPr>
-          <w:hyperlink w:anchor="_Toc244268260" w:history="1">
+          <w:hyperlink w:anchor="_Toc244356177" w:history="1">
             <w:r>
               <w:rPr>
                 <w:rStyle w:val="Hyperlink"/>
@@ -6163,7 +6163,7 @@
                 <w:noProof/>
                 <w:webHidden/>
               </w:rPr>
-              <w:instrText xml:space="preserve"> PAGEREF _Toc244268260 \h </w:instrText>
+              <w:instrText xml:space="preserve"> PAGEREF _Toc244356177 \h </w:instrText>
             </w:r>
             <w:r>
               <w:rPr>
@@ -6209,7 +6209,7 @@
               <w:lang w:val="en-IN" w:eastAsia="en-IN"/>
             </w:rPr>
           </w:pPr>
-          <w:hyperlink w:anchor="_Toc244268261" w:history="1">
+          <w:hyperlink w:anchor="_Toc244356178" w:history="1">
             <w:r>
               <w:rPr>
                 <w:rStyle w:val="Hyperlink"/>
@@ -6269,7 +6269,7 @@
                 <w:noProof/>
                 <w:webHidden/>
               </w:rPr>
-              <w:instrText xml:space="preserve"> PAGEREF _Toc244268261 \h </w:instrText>
+              <w:instrText xml:space="preserve"> PAGEREF _Toc244356178 \h </w:instrText>
             </w:r>
             <w:r>
               <w:rPr>
@@ -6315,7 +6315,7 @@
               <w:lang w:val="en-IN" w:eastAsia="en-IN"/>
             </w:rPr>
           </w:pPr>
-          <w:hyperlink w:anchor="_Toc244268262" w:history="1">
+          <w:hyperlink w:anchor="_Toc244356179" w:history="1">
             <w:r>
               <w:rPr>
                 <w:rStyle w:val="Hyperlink"/>
@@ -6405,7 +6405,7 @@
                 <w:noProof/>
                 <w:webHidden/>
               </w:rPr>
-              <w:instrText xml:space="preserve"> PAGEREF _Toc244268262 \h </w:instrText>
+              <w:instrText xml:space="preserve"> PAGEREF _Toc244356179 \h </w:instrText>
             </w:r>
             <w:r>
               <w:rPr>
@@ -6453,7 +6453,7 @@
               <w:lang w:val="en-IN" w:eastAsia="en-IN"/>
             </w:rPr>
           </w:pPr>
-          <w:hyperlink w:anchor="_Toc244268263" w:history="1">
+          <w:hyperlink w:anchor="_Toc244356180" w:history="1">
             <w:r>
               <w:rPr>
                 <w:rStyle w:val="Hyperlink"/>
@@ -6515,7 +6515,7 @@
                 <w:noProof/>
                 <w:webHidden/>
               </w:rPr>
-              <w:instrText xml:space="preserve"> PAGEREF _Toc244268263 \h </w:instrText>
+              <w:instrText xml:space="preserve"> PAGEREF _Toc244356180 \h </w:instrText>
             </w:r>
             <w:r>
               <w:rPr>
@@ -6561,7 +6561,7 @@
               <w:lang w:val="en-IN" w:eastAsia="en-IN"/>
             </w:rPr>
           </w:pPr>
-          <w:hyperlink w:anchor="_Toc244268264" w:history="1">
+          <w:hyperlink w:anchor="_Toc244356181" w:history="1">
             <w:r>
               <w:rPr>
                 <w:rStyle w:val="Hyperlink"/>
@@ -6621,7 +6621,7 @@
                 <w:noProof/>
                 <w:webHidden/>
               </w:rPr>
-              <w:instrText xml:space="preserve"> PAGEREF _Toc244268264 \h </w:instrText>
+              <w:instrText xml:space="preserve"> PAGEREF _Toc244356181 \h </w:instrText>
             </w:r>
             <w:r>
               <w:rPr>
@@ -6667,7 +6667,7 @@
               <w:lang w:val="en-IN" w:eastAsia="en-IN"/>
             </w:rPr>
           </w:pPr>
-          <w:hyperlink w:anchor="_Toc244268265" w:history="1">
+          <w:hyperlink w:anchor="_Toc244356182" w:history="1">
             <w:r>
               <w:rPr>
                 <w:rStyle w:val="Hyperlink"/>
@@ -6787,7 +6787,7 @@
                 <w:noProof/>
                 <w:webHidden/>
               </w:rPr>
-              <w:instrText xml:space="preserve"> PAGEREF _Toc244268265 \h </w:instrText>
+              <w:instrText xml:space="preserve"> PAGEREF _Toc244356182 \h </w:instrText>
             </w:r>
             <w:r>
               <w:rPr>
@@ -6833,7 +6833,7 @@
               <w:lang w:val="en-IN" w:eastAsia="en-IN"/>
             </w:rPr>
           </w:pPr>
-          <w:hyperlink w:anchor="_Toc244268266" w:history="1">
+          <w:hyperlink w:anchor="_Toc244356183" w:history="1">
             <w:r>
               <w:rPr>
                 <w:rStyle w:val="Hyperlink"/>
@@ -6923,7 +6923,7 @@
                 <w:noProof/>
                 <w:webHidden/>
               </w:rPr>
-              <w:instrText xml:space="preserve"> PAGEREF _Toc244268266 \h </w:instrText>
+              <w:instrText xml:space="preserve"> PAGEREF _Toc244356183 \h </w:instrText>
             </w:r>
             <w:r>
               <w:rPr>
@@ -6969,7 +6969,7 @@
               <w:lang w:val="en-IN" w:eastAsia="en-IN"/>
             </w:rPr>
           </w:pPr>
-          <w:hyperlink w:anchor="_Toc244268285" w:history="1">
+          <w:hyperlink w:anchor="_Toc244356184" w:history="1">
             <w:r>
               <w:rPr>
                 <w:rStyle w:val="Hyperlink"/>
@@ -7104,7 +7104,7 @@
                 <w:noProof/>
                 <w:webHidden/>
               </w:rPr>
-              <w:instrText xml:space="preserve"> PAGEREF _Toc244268285 \h </w:instrText>
+              <w:instrText xml:space="preserve"> PAGEREF _Toc244356184 \h </w:instrText>
             </w:r>
             <w:r>
               <w:rPr>
@@ -7150,7 +7150,7 @@
               <w:lang w:val="en-IN" w:eastAsia="en-IN"/>
             </w:rPr>
           </w:pPr>
-          <w:hyperlink w:anchor="_Toc244268286" w:history="1">
+          <w:hyperlink w:anchor="_Toc244356185" w:history="1">
             <w:r>
               <w:rPr>
                 <w:rStyle w:val="Hyperlink"/>
@@ -7240,7 +7240,7 @@
                 <w:noProof/>
                 <w:webHidden/>
               </w:rPr>
-              <w:instrText xml:space="preserve"> PAGEREF _Toc244268286 \h </w:instrText>
+              <w:instrText xml:space="preserve"> PAGEREF _Toc244356185 \h </w:instrText>
             </w:r>
             <w:r>
               <w:rPr>
@@ -7286,7 +7286,7 @@
               <w:lang w:val="en-IN" w:eastAsia="en-IN"/>
             </w:rPr>
           </w:pPr>
-          <w:hyperlink w:anchor="_Toc244268287" w:history="1">
+          <w:hyperlink w:anchor="_Toc244356186" w:history="1">
             <w:r>
               <w:rPr>
                 <w:rStyle w:val="Hyperlink"/>
@@ -7391,7 +7391,7 @@
                 <w:noProof/>
                 <w:webHidden/>
               </w:rPr>
-              <w:instrText xml:space="preserve"> PAGEREF _Toc244268287 \h </w:instrText>
+              <w:instrText xml:space="preserve"> PAGEREF _Toc244356186 \h </w:instrText>
             </w:r>
             <w:r>
               <w:rPr>
@@ -7437,7 +7437,7 @@
               <w:lang w:val="en-IN" w:eastAsia="en-IN"/>
             </w:rPr>
           </w:pPr>
-          <w:hyperlink w:anchor="_Toc244268288" w:history="1">
+          <w:hyperlink w:anchor="_Toc244356187" w:history="1">
             <w:r>
               <w:rPr>
                 <w:rStyle w:val="Hyperlink"/>
@@ -7504,7 +7504,7 @@
                 <w:noProof/>
                 <w:webHidden/>
               </w:rPr>
-              <w:instrText xml:space="preserve"> PAGEREF _Toc244268288 \h </w:instrText>
+              <w:instrText xml:space="preserve"> PAGEREF _Toc244356187 \h </w:instrText>
             </w:r>
             <w:r>
               <w:rPr>
@@ -7550,7 +7550,7 @@
               <w:lang w:val="en-IN" w:eastAsia="en-IN"/>
             </w:rPr>
           </w:pPr>
-          <w:hyperlink w:anchor="_Toc244268289" w:history="1">
+          <w:hyperlink w:anchor="_Toc244356188" w:history="1">
             <w:r>
               <w:rPr>
                 <w:rStyle w:val="Hyperlink"/>
@@ -7662,7 +7662,7 @@
                 <w:noProof/>
                 <w:webHidden/>
               </w:rPr>
-              <w:instrText xml:space="preserve"> PAGEREF _Toc244268289 \h </w:instrText>
+              <w:instrText xml:space="preserve"> PAGEREF _Toc244356188 \h </w:instrText>
             </w:r>
             <w:r>
               <w:rPr>
@@ -7708,7 +7708,7 @@
               <w:lang w:val="en-IN" w:eastAsia="en-IN"/>
             </w:rPr>
           </w:pPr>
-          <w:hyperlink w:anchor="_Toc244268290" w:history="1">
+          <w:hyperlink w:anchor="_Toc244356189" w:history="1">
             <w:r>
               <w:rPr>
                 <w:rStyle w:val="Hyperlink"/>
@@ -7843,7 +7843,7 @@
                 <w:noProof/>
                 <w:webHidden/>
               </w:rPr>
-              <w:instrText xml:space="preserve"> PAGEREF _Toc244268290 \h </w:instrText>
+              <w:instrText xml:space="preserve"> PAGEREF _Toc244356189 \h </w:instrText>
             </w:r>
             <w:r>
               <w:rPr>
@@ -7889,7 +7889,7 @@
               <w:lang w:val="en-IN" w:eastAsia="en-IN"/>
             </w:rPr>
           </w:pPr>
-          <w:hyperlink w:anchor="_Toc244268291" w:history="1">
+          <w:hyperlink w:anchor="_Toc244356190" w:history="1">
             <w:r>
               <w:rPr>
                 <w:rStyle w:val="Hyperlink"/>
@@ -8031,7 +8031,7 @@
                 <w:noProof/>
                 <w:webHidden/>
               </w:rPr>
-              <w:instrText xml:space="preserve"> PAGEREF _Toc244268291 \h </w:instrText>
+              <w:instrText xml:space="preserve"> PAGEREF _Toc244356190 \h </w:instrText>
             </w:r>
             <w:r>
               <w:rPr>
@@ -8077,7 +8077,7 @@
               <w:lang w:val="en-IN" w:eastAsia="en-IN"/>
             </w:rPr>
           </w:pPr>
-          <w:hyperlink w:anchor="_Toc244268292" w:history="1">
+          <w:hyperlink w:anchor="_Toc244356191" w:history="1">
             <w:r>
               <w:rPr>
                 <w:rStyle w:val="Hyperlink"/>
@@ -8121,7 +8121,7 @@
                 <w:noProof/>
                 <w:webHidden/>
               </w:rPr>
-              <w:instrText xml:space="preserve"> PAGEREF _Toc244268292 \h </w:instrText>
+              <w:instrText xml:space="preserve"> PAGEREF _Toc244356191 \h </w:instrText>
             </w:r>
             <w:r>
               <w:rPr>
@@ -8167,7 +8167,7 @@
               <w:lang w:val="en-IN" w:eastAsia="en-IN"/>
             </w:rPr>
           </w:pPr>
-          <w:hyperlink w:anchor="_Toc244268293" w:history="1">
+          <w:hyperlink w:anchor="_Toc244356192" w:history="1">
             <w:r>
               <w:rPr>
                 <w:rStyle w:val="Hyperlink"/>
@@ -8242,7 +8242,7 @@
                 <w:noProof/>
                 <w:webHidden/>
               </w:rPr>
-              <w:instrText xml:space="preserve"> PAGEREF _Toc244268293 \h </w:instrText>
+              <w:instrText xml:space="preserve"> PAGEREF _Toc244356192 \h </w:instrText>
             </w:r>
             <w:r>
               <w:rPr>
@@ -8290,7 +8290,7 @@
               <w:lang w:val="en-IN" w:eastAsia="en-IN"/>
             </w:rPr>
           </w:pPr>
-          <w:hyperlink w:anchor="_Toc244268294" w:history="1">
+          <w:hyperlink w:anchor="_Toc244356193" w:history="1">
             <w:r>
               <w:rPr>
                 <w:rStyle w:val="Hyperlink"/>
@@ -8382,7 +8382,7 @@
                 <w:noProof/>
                 <w:webHidden/>
               </w:rPr>
-              <w:instrText xml:space="preserve"> PAGEREF _Toc244268294 \h </w:instrText>
+              <w:instrText xml:space="preserve"> PAGEREF _Toc244356193 \h </w:instrText>
             </w:r>
             <w:r>
               <w:rPr>
@@ -8402,7 +8402,7 @@
                 <w:noProof/>
                 <w:webHidden/>
               </w:rPr>
-              <w:t>33</w:t>
+              <w:t>34</w:t>
             </w:r>
             <w:r>
               <w:rPr>
@@ -8430,7 +8430,7 @@
               <w:lang w:val="en-IN" w:eastAsia="en-IN"/>
             </w:rPr>
           </w:pPr>
-          <w:hyperlink w:anchor="_Toc244268295" w:history="1">
+          <w:hyperlink w:anchor="_Toc244356194" w:history="1">
             <w:r>
               <w:rPr>
                 <w:rStyle w:val="Hyperlink"/>
@@ -8477,7 +8477,7 @@
                 <w:noProof/>
                 <w:webHidden/>
               </w:rPr>
-              <w:instrText xml:space="preserve"> PAGEREF _Toc244268295 \h </w:instrText>
+              <w:instrText xml:space="preserve"> PAGEREF _Toc244356194 \h </w:instrText>
             </w:r>
             <w:r>
               <w:rPr>
@@ -8497,7 +8497,7 @@
                 <w:noProof/>
                 <w:webHidden/>
               </w:rPr>
-              <w:t>34</w:t>
+              <w:t>35</w:t>
             </w:r>
             <w:r>
               <w:rPr>
@@ -8524,7 +8524,7 @@
               <w:lang w:val="en-IN" w:eastAsia="en-IN"/>
             </w:rPr>
           </w:pPr>
-          <w:hyperlink w:anchor="_Toc244268296" w:history="1">
+          <w:hyperlink w:anchor="_Toc244356195" w:history="1">
             <w:r>
               <w:rPr>
                 <w:rStyle w:val="Hyperlink"/>
@@ -8552,7 +8552,7 @@
                 <w:noProof/>
                 <w:webHidden/>
               </w:rPr>
-              <w:instrText xml:space="preserve"> PAGEREF _Toc244268296 \h </w:instrText>
+              <w:instrText xml:space="preserve"> PAGEREF _Toc244356195 \h </w:instrText>
             </w:r>
             <w:r>
               <w:rPr>
@@ -8572,7 +8572,7 @@
                 <w:noProof/>
                 <w:webHidden/>
               </w:rPr>
-              <w:t>35</w:t>
+              <w:t>36</w:t>
             </w:r>
             <w:r>
               <w:rPr>
@@ -13632,7 +13632,7 @@
         <w:jc w:val="left"/>
       </w:pPr>
       <w:bookmarkStart w:id="6" w:name="1._INTRODUCTION"/>
-      <w:bookmarkStart w:id="7" w:name="_Toc244268230"/>
+      <w:bookmarkStart w:id="7" w:name="_Toc244356147"/>
       <w:bookmarkEnd w:id="6"/>
       <w:r>
         <w:rPr>
@@ -13868,7 +13868,7 @@
         <w:spacing w:before="209"/>
         <w:ind w:left="590" w:hanging="471"/>
       </w:pPr>
-      <w:bookmarkStart w:id="8" w:name="_Toc244268231"/>
+      <w:bookmarkStart w:id="8" w:name="_Toc244356148"/>
       <w:r>
         <w:rPr>
           <w:spacing w:val="-2"/>
@@ -14079,7 +14079,7 @@
         <w:spacing w:before="160"/>
         <w:ind w:left="590" w:hanging="471"/>
       </w:pPr>
-      <w:bookmarkStart w:id="10" w:name="_Toc244268232"/>
+      <w:bookmarkStart w:id="10" w:name="_Toc244356149"/>
       <w:r>
         <w:rPr>
           <w:spacing w:val="-2"/>
@@ -14261,7 +14261,7 @@
         <w:spacing w:before="215"/>
         <w:ind w:left="590" w:hanging="471"/>
       </w:pPr>
-      <w:bookmarkStart w:id="11" w:name="_Toc244268233"/>
+      <w:bookmarkStart w:id="11" w:name="_Toc244356150"/>
       <w:r>
         <w:rPr>
           <w:spacing w:val="-2"/>
@@ -14375,7 +14375,7 @@
         <w:jc w:val="left"/>
       </w:pPr>
       <w:bookmarkStart w:id="12" w:name="2._LITERATURE_SURVEY"/>
-      <w:bookmarkStart w:id="13" w:name="_Toc244268234"/>
+      <w:bookmarkStart w:id="13" w:name="_Toc244356151"/>
       <w:bookmarkEnd w:id="12"/>
       <w:r>
         <w:t>LITERATURE</w:t>
@@ -14409,7 +14409,7 @@
         <w:ind w:left="590" w:hanging="471"/>
       </w:pPr>
       <w:bookmarkStart w:id="14" w:name="2.1._Literature_Survey"/>
-      <w:bookmarkStart w:id="15" w:name="_Toc244268235"/>
+      <w:bookmarkStart w:id="15" w:name="_Toc244356152"/>
       <w:bookmarkEnd w:id="14"/>
       <w:r>
         <w:t>Literature</w:t>
@@ -17969,7 +17969,7 @@
         <w:ind w:left="590" w:hanging="471"/>
       </w:pPr>
       <w:bookmarkStart w:id="20" w:name="2.2._Inference"/>
-      <w:bookmarkStart w:id="21" w:name="_Toc244268236"/>
+      <w:bookmarkStart w:id="21" w:name="_Toc244356153"/>
       <w:bookmarkEnd w:id="20"/>
       <w:r>
         <w:rPr>
@@ -18084,7 +18084,7 @@
         <w:ind w:left="590" w:hanging="471"/>
       </w:pPr>
       <w:bookmarkStart w:id="22" w:name="2.3._Research_Gap"/>
-      <w:bookmarkStart w:id="23" w:name="_Toc244268237"/>
+      <w:bookmarkStart w:id="23" w:name="_Toc244356154"/>
       <w:bookmarkEnd w:id="22"/>
       <w:r>
         <w:t>Research</w:t>
@@ -18133,7 +18133,7 @@
         <w:ind w:left="590" w:hanging="471"/>
       </w:pPr>
       <w:bookmarkStart w:id="24" w:name="2.4._Research_Objectives"/>
-      <w:bookmarkStart w:id="25" w:name="_Toc244268238"/>
+      <w:bookmarkStart w:id="25" w:name="_Toc244356155"/>
       <w:bookmarkEnd w:id="24"/>
       <w:r>
         <w:t>Research</w:t>
@@ -18297,7 +18297,7 @@
         <w:jc w:val="left"/>
       </w:pPr>
       <w:bookmarkStart w:id="26" w:name="3._SYSTEM_REQUIREMENTS"/>
-      <w:bookmarkStart w:id="27" w:name="_Toc244268239"/>
+      <w:bookmarkStart w:id="27" w:name="_Toc244356156"/>
       <w:bookmarkEnd w:id="26"/>
       <w:r>
         <w:t>SYSTEM</w:t>
@@ -18331,7 +18331,7 @@
         <w:ind w:left="590" w:hanging="471"/>
       </w:pPr>
       <w:bookmarkStart w:id="28" w:name="3.1._Hardware_Requirements"/>
-      <w:bookmarkStart w:id="29" w:name="_Toc244268240"/>
+      <w:bookmarkStart w:id="29" w:name="_Toc244356157"/>
       <w:bookmarkEnd w:id="28"/>
       <w:r>
         <w:t>Hardware</w:t>
@@ -18515,7 +18515,7 @@
         <w:ind w:left="590" w:hanging="471"/>
       </w:pPr>
       <w:bookmarkStart w:id="30" w:name="3.2._Software_Requirements"/>
-      <w:bookmarkStart w:id="31" w:name="_Toc244268241"/>
+      <w:bookmarkStart w:id="31" w:name="_Toc244356158"/>
       <w:bookmarkEnd w:id="30"/>
       <w:r>
         <w:t>Software</w:t>
@@ -19931,7 +19931,7 @@
         <w:ind w:left="590" w:hanging="471"/>
       </w:pPr>
       <w:bookmarkStart w:id="32" w:name="3.3._Datasets"/>
-      <w:bookmarkStart w:id="33" w:name="_Toc244268242"/>
+      <w:bookmarkStart w:id="33" w:name="_Toc244356159"/>
       <w:bookmarkEnd w:id="32"/>
       <w:r>
         <w:rPr>
@@ -21705,7 +21705,7 @@
         <w:jc w:val="left"/>
       </w:pPr>
       <w:bookmarkStart w:id="34" w:name="4._SYSTEM_DESIGN"/>
-      <w:bookmarkStart w:id="35" w:name="_Toc244268243"/>
+      <w:bookmarkStart w:id="35" w:name="_Toc244356160"/>
       <w:bookmarkEnd w:id="34"/>
       <w:r>
         <w:t>SYSTEM</w:t>
@@ -21739,7 +21739,7 @@
         <w:ind w:left="590" w:hanging="471"/>
       </w:pPr>
       <w:bookmarkStart w:id="36" w:name="4.1._Overall_Architecture"/>
-      <w:bookmarkStart w:id="37" w:name="_Toc244268244"/>
+      <w:bookmarkStart w:id="37" w:name="_Toc244356161"/>
       <w:bookmarkEnd w:id="36"/>
       <w:r>
         <w:t>Overall</w:t>
@@ -21972,7 +21972,7 @@
         <w:ind w:left="590" w:hanging="471"/>
       </w:pPr>
       <w:bookmarkStart w:id="38" w:name="4.2._Simulation_Environment"/>
-      <w:bookmarkStart w:id="39" w:name="_Toc244268245"/>
+      <w:bookmarkStart w:id="39" w:name="_Toc244356162"/>
       <w:bookmarkEnd w:id="38"/>
       <w:r>
         <w:t>Simulation</w:t>
@@ -24406,7 +24406,7 @@
         <w:ind w:left="590" w:hanging="471"/>
       </w:pPr>
       <w:bookmarkStart w:id="44" w:name="4.3._Two_Simulation_Modes"/>
-      <w:bookmarkStart w:id="45" w:name="_Toc244268246"/>
+      <w:bookmarkStart w:id="45" w:name="_Toc244356163"/>
       <w:bookmarkEnd w:id="44"/>
       <w:r>
         <w:t>Two</w:t>
@@ -24774,7 +24774,7 @@
         <w:ind w:left="590" w:hanging="471"/>
       </w:pPr>
       <w:bookmarkStart w:id="46" w:name="4.4._Candidate_Viewpoint_Graph"/>
-      <w:bookmarkStart w:id="47" w:name="_Toc244268247"/>
+      <w:bookmarkStart w:id="47" w:name="_Toc244356164"/>
       <w:bookmarkEnd w:id="46"/>
       <w:r>
         <w:t>Candidate</w:t>
@@ -25179,7 +25179,7 @@
         <w:ind w:left="590" w:hanging="471"/>
       </w:pPr>
       <w:bookmarkStart w:id="48" w:name="4.5._Scenarios"/>
-      <w:bookmarkStart w:id="49" w:name="_Toc244268248"/>
+      <w:bookmarkStart w:id="49" w:name="_Toc244356165"/>
       <w:bookmarkEnd w:id="48"/>
       <w:r>
         <w:rPr>
@@ -26250,7 +26250,7 @@
         <w:ind w:left="590" w:hanging="471"/>
       </w:pPr>
       <w:bookmarkStart w:id="50" w:name="4.6._Perception"/>
-      <w:bookmarkStart w:id="51" w:name="_Toc244268249"/>
+      <w:bookmarkStart w:id="51" w:name="_Toc244356166"/>
       <w:bookmarkEnd w:id="50"/>
       <w:r>
         <w:rPr>
@@ -26515,7 +26515,7 @@
         <w:ind w:left="590" w:hanging="471"/>
       </w:pPr>
       <w:bookmarkStart w:id="52" w:name="4.7._3-D_Localisation"/>
-      <w:bookmarkStart w:id="53" w:name="_Toc244268250"/>
+      <w:bookmarkStart w:id="53" w:name="_Toc244356167"/>
       <w:bookmarkEnd w:id="52"/>
       <w:r>
         <w:t>3-D</w:t>
@@ -26678,7 +26678,7 @@
         <w:ind w:left="590" w:hanging="471"/>
       </w:pPr>
       <w:bookmarkStart w:id="54" w:name="4.8._Persistent_Defect_Memory"/>
-      <w:bookmarkStart w:id="55" w:name="_Toc244268251"/>
+      <w:bookmarkStart w:id="55" w:name="_Toc244356168"/>
       <w:bookmarkEnd w:id="54"/>
       <w:r>
         <w:t>Persistent</w:t>
@@ -26960,7 +26960,7 @@
         <w:ind w:left="590" w:hanging="471"/>
       </w:pPr>
       <w:bookmarkStart w:id="56" w:name="4.9._The_UW-TIG_Planner"/>
-      <w:bookmarkStart w:id="57" w:name="_Toc244268252"/>
+      <w:bookmarkStart w:id="57" w:name="_Toc244356169"/>
       <w:bookmarkEnd w:id="56"/>
       <w:r>
         <w:t>The</w:t>
@@ -28802,7 +28802,7 @@
         <w:ind w:left="723" w:hanging="604"/>
       </w:pPr>
       <w:bookmarkStart w:id="63" w:name="4.10._Reporting_Rule_and_Metrics"/>
-      <w:bookmarkStart w:id="64" w:name="_Toc244268253"/>
+      <w:bookmarkStart w:id="64" w:name="_Toc244356170"/>
       <w:bookmarkEnd w:id="63"/>
       <w:r>
         <w:t>Reporting</w:t>
@@ -28983,7 +28983,7 @@
         <w:ind w:left="723" w:hanging="604"/>
       </w:pPr>
       <w:bookmarkStart w:id="65" w:name="4.11._Re-implemented_Baselines"/>
-      <w:bookmarkStart w:id="66" w:name="_Toc244268254"/>
+      <w:bookmarkStart w:id="66" w:name="_Toc244356171"/>
       <w:bookmarkEnd w:id="65"/>
       <w:r>
         <w:t>Re-implemented</w:t>
@@ -30357,7 +30357,7 @@
         <w:ind w:left="723" w:hanging="604"/>
       </w:pPr>
       <w:bookmarkStart w:id="67" w:name="4.12._Why_PyBullet_and_Not_Unity_or_Unre"/>
-      <w:bookmarkStart w:id="68" w:name="_Toc244268255"/>
+      <w:bookmarkStart w:id="68" w:name="_Toc244356172"/>
       <w:bookmarkEnd w:id="67"/>
       <w:r>
         <w:t>Why</w:t>
@@ -30474,7 +30474,7 @@
         <w:jc w:val="left"/>
       </w:pPr>
       <w:bookmarkStart w:id="69" w:name="5._SYSTEM_IMPLEMENTATION"/>
-      <w:bookmarkStart w:id="70" w:name="_Toc244268256"/>
+      <w:bookmarkStart w:id="70" w:name="_Toc244356173"/>
       <w:bookmarkEnd w:id="69"/>
       <w:r>
         <w:t>SYSTEM</w:t>
@@ -30518,7 +30518,7 @@
         <w:ind w:left="590" w:hanging="471"/>
       </w:pPr>
       <w:bookmarkStart w:id="71" w:name="5.1._Code_Organisation"/>
-      <w:bookmarkStart w:id="72" w:name="_Toc244268257"/>
+      <w:bookmarkStart w:id="72" w:name="_Toc244356174"/>
       <w:bookmarkEnd w:id="71"/>
       <w:r>
         <w:t>Code</w:t>
@@ -32095,7 +32095,7 @@
         <w:ind w:left="590" w:hanging="471"/>
       </w:pPr>
       <w:bookmarkStart w:id="73" w:name="5.2._Implementing_the_Simulation"/>
-      <w:bookmarkStart w:id="74" w:name="_Toc244268258"/>
+      <w:bookmarkStart w:id="74" w:name="_Toc244356175"/>
       <w:bookmarkEnd w:id="73"/>
       <w:r>
         <w:t>Implementing</w:t>
@@ -32203,7 +32203,7 @@
         <w:ind w:left="590" w:hanging="471"/>
       </w:pPr>
       <w:bookmarkStart w:id="75" w:name="5.3._The_Mission_Loop"/>
-      <w:bookmarkStart w:id="76" w:name="_Toc244268259"/>
+      <w:bookmarkStart w:id="76" w:name="_Toc244356176"/>
       <w:bookmarkEnd w:id="75"/>
       <w:r>
         <w:t>The</w:t>
@@ -38638,7 +38638,7 @@
         <w:ind w:left="590" w:hanging="471"/>
       </w:pPr>
       <w:bookmarkStart w:id="77" w:name="5.4._Experiment_Harness_and_Protocol"/>
-      <w:bookmarkStart w:id="78" w:name="_Toc244268260"/>
+      <w:bookmarkStart w:id="78" w:name="_Toc244356177"/>
       <w:bookmarkEnd w:id="77"/>
       <w:r>
         <w:t>Experiment</w:t>
@@ -38977,7 +38977,7 @@
         <w:ind w:left="590" w:hanging="471"/>
       </w:pPr>
       <w:bookmarkStart w:id="79" w:name="5.5._Debugging_Episodes"/>
-      <w:bookmarkStart w:id="80" w:name="_Toc244268261"/>
+      <w:bookmarkStart w:id="80" w:name="_Toc244356178"/>
       <w:bookmarkEnd w:id="79"/>
       <w:r>
         <w:lastRenderedPageBreak/>
@@ -39145,7 +39145,7 @@
         <w:ind w:left="590" w:hanging="471"/>
       </w:pPr>
       <w:bookmarkStart w:id="81" w:name="5.6._Demonstration_and_Comparison_Videos"/>
-      <w:bookmarkStart w:id="82" w:name="_Toc244268262"/>
+      <w:bookmarkStart w:id="82" w:name="_Toc244356179"/>
       <w:bookmarkEnd w:id="81"/>
       <w:r>
         <w:t>Demonstration</w:t>
@@ -39835,7 +39835,7 @@
         <w:jc w:val="left"/>
       </w:pPr>
       <w:bookmarkStart w:id="83" w:name="6._EXPERIMENTAL_RESULTS"/>
-      <w:bookmarkStart w:id="84" w:name="_Toc244268263"/>
+      <w:bookmarkStart w:id="84" w:name="_Toc244356180"/>
       <w:bookmarkEnd w:id="83"/>
       <w:r>
         <w:t>EXPERIMENTAL</w:t>
@@ -39869,7 +39869,7 @@
         <w:ind w:left="590" w:hanging="471"/>
       </w:pPr>
       <w:bookmarkStart w:id="85" w:name="6.1._Detector_Benchmark"/>
-      <w:bookmarkStart w:id="86" w:name="_Toc244268264"/>
+      <w:bookmarkStart w:id="86" w:name="_Toc244356181"/>
       <w:bookmarkEnd w:id="85"/>
       <w:r>
         <w:t>Detector</w:t>
@@ -41379,7 +41379,7 @@
         <w:ind w:left="590" w:hanging="471"/>
       </w:pPr>
       <w:bookmarkStart w:id="87" w:name="6.2._How_the_Closed-Loop_Numbers_Reached"/>
-      <w:bookmarkStart w:id="88" w:name="_Toc244268265"/>
+      <w:bookmarkStart w:id="88" w:name="_Toc244356182"/>
       <w:bookmarkEnd w:id="87"/>
       <w:r>
         <w:t>How</w:t>
@@ -43305,7 +43305,7 @@
         <w:ind w:left="590" w:hanging="471"/>
       </w:pPr>
       <w:bookmarkStart w:id="89" w:name="6.3._Closed-Loop_Comparison_and_Ablation"/>
-      <w:bookmarkStart w:id="90" w:name="_Toc244268266"/>
+      <w:bookmarkStart w:id="90" w:name="_Toc244356183"/>
       <w:bookmarkEnd w:id="89"/>
       <w:r>
         <w:t>Closed-Loop</w:t>
@@ -44597,7 +44597,7 @@
         <w:spacing w:before="210"/>
         <w:ind w:left="590" w:hanging="471"/>
       </w:pPr>
-      <w:bookmarkStart w:id="92" w:name="_Toc244268285"/>
+      <w:bookmarkStart w:id="92" w:name="_Toc244356184"/>
       <w:r>
         <w:t>Why</w:t>
       </w:r>
@@ -44816,7 +44816,7 @@
         <w:ind w:left="590" w:hanging="471"/>
       </w:pPr>
       <w:bookmarkStart w:id="93" w:name="6.5._Head-to-Head_with_Published_Planner"/>
-      <w:bookmarkStart w:id="94" w:name="_Toc244268286"/>
+      <w:bookmarkStart w:id="94" w:name="_Toc244356185"/>
       <w:bookmarkEnd w:id="93"/>
       <w:r>
         <w:t>Head-to-Head</w:t>
@@ -46888,7 +46888,7 @@
         <w:ind w:left="590" w:hanging="471"/>
       </w:pPr>
       <w:bookmarkStart w:id="95" w:name="6.6._Calibration_of_the_Uncertainty_Sign"/>
-      <w:bookmarkStart w:id="96" w:name="_Toc244268287"/>
+      <w:bookmarkStart w:id="96" w:name="_Toc244356186"/>
       <w:bookmarkEnd w:id="95"/>
       <w:r>
         <w:t>Calibration</w:t>
@@ -46982,7 +46982,7 @@
         <w:spacing w:before="211"/>
         <w:ind w:left="590" w:hanging="471"/>
       </w:pPr>
-      <w:bookmarkStart w:id="98" w:name="_Toc244268288"/>
+      <w:bookmarkStart w:id="98" w:name="_Toc244356187"/>
       <w:r>
         <w:t>The</w:t>
       </w:r>
@@ -47156,7 +47156,7 @@
         <w:ind w:left="590" w:hanging="471"/>
       </w:pPr>
       <w:bookmarkStart w:id="99" w:name="6.8._A_Broader_Detector:_Multi-Dataset_F"/>
-      <w:bookmarkStart w:id="100" w:name="_Toc244268289"/>
+      <w:bookmarkStart w:id="100" w:name="_Toc244356188"/>
       <w:bookmarkEnd w:id="99"/>
       <w:r>
         <w:t>A</w:t>
@@ -49019,7 +49019,7 @@
         <w:ind w:left="590" w:hanging="471"/>
       </w:pPr>
       <w:bookmarkStart w:id="101" w:name="6.9._Scaling_the_Evaluation_to_a_31-Wall"/>
-      <w:bookmarkStart w:id="102" w:name="_Toc244268290"/>
+      <w:bookmarkStart w:id="102" w:name="_Toc244356189"/>
       <w:bookmarkEnd w:id="101"/>
       <w:r>
         <w:lastRenderedPageBreak/>
@@ -54413,7 +54413,7 @@
         <w:spacing w:before="209"/>
         <w:ind w:left="723" w:hanging="604"/>
       </w:pPr>
-      <w:bookmarkStart w:id="103" w:name="_Toc244268291"/>
+      <w:bookmarkStart w:id="103" w:name="_Toc244356190"/>
       <w:r>
         <w:t>Does</w:t>
       </w:r>
@@ -55444,7 +55444,7 @@
         <w:ind w:left="723" w:hanging="604"/>
       </w:pPr>
       <w:bookmarkStart w:id="104" w:name="6.10._Does_a_Broader_Detector_Improve_th"/>
-      <w:bookmarkStart w:id="105" w:name="_Toc244268292"/>
+      <w:bookmarkStart w:id="105" w:name="_Toc244356191"/>
       <w:bookmarkEnd w:id="104"/>
       <w:r>
         <w:t>Planner-Only Tests: Oracle Detector, Weight Sensitivity and Ten Seeds</w:t>
@@ -55505,7 +55505,7 @@
           <w:sz w:val="24"/>
         </w:rPr>
         <w:lastRenderedPageBreak/>
-        <w:t>Weight sensitivity. Setting both weights to 0, 6 and 20 leaves F1 unchanged (9 walls: 0.918 in all three; 31 walls: 0.822, 0.821, 0.820). The terms do not change the route even when they dominate the score.</w:t>
+        <w:t>Weight sensitivity. Setting both weights to 0, 6 and 20 leaves F1 unchanged (oracle detector, static, uncertain and growing scenarios; 9 walls: 0.918 in all three; 31 walls: 0.822, 0.821, 0.820). The terms do not change the route even when they dominate the score.</w:t>
       </w:r>
     </w:p>
     <w:p>
@@ -55527,7 +55527,7 @@
           <w:bCs/>
           <w:sz w:val="24"/>
         </w:rPr>
-        <w:t>Staleness and lookahead. Without them the flight is shorter (9 walls: 80.6 m against 124.9 m; 31 walls, oracle: 407 and 445 m against 480 m). With the real detector F1 is unchanged over ten seeds (0.933); with the oracle it falls slightly (31 walls: 0.862 and 0.864 against 0.871). These two terms add flight cost rather than detection quality in this simulator.</w:t>
+        <w:t>Staleness and lookahead. Without them the flight is shorter (9 walls: 81 to 83 m against 125 m; 31 walls: 417 and 446 m against 481 m). With the real detector the confirmed F1 does not fall: on the 9-wall yard it is higher, 0.973 against 0.963 (paired +0.010 in favour of removing them, 95% CI +0.003 to +0.017, all 10 seeds); on the 31-wall yard it is 0.925 and 0.920 against 0.921, a tie. With the oracle detector F1 falls slightly (31 walls 0.862 and 0.864 against 0.871). These two terms therefore cost flight, and in the 9-wall yard they cost a little detection quality as well.</w:t>
       </w:r>
     </w:p>
     <w:p>
@@ -55549,7 +55549,7 @@
           <w:bCs/>
           <w:sz w:val="24"/>
         </w:rPr>
-        <w:t>Ten seeds, 9-wall yard, real detector (seeds 0 to 9). UW-TIG 0.933 F1 at 124.9 m; Alamdari 0.922 at 168 m; Rückin 0.911 at 218 m; GATSBI 0.905; random 0.860 at 379 m; Bircher 0.813; Isler 0.655; no coverage phase 0.676. UW-TIG minus Rückin is +0.022 (95% CI −0.002 to +0.055) and minus Alamdari +0.011 (−0.003 to +0.027): ahead on average but not significantly. The 31-wall ten-seed run was not completed.</w:t>
+        <w:t>Ten seeds, original detector, confirmed F1 (seeds 0 to 9). 9-wall yard: UW-TIG 0.963 (95% CI 0.941 to 0.982) at 125 m; Alamdari 0.951 at 168 m; Rückin 0.938 at 206 m; GATSBI 0.914; random 0.891 at 379 m; Bircher 0.816; Isler 0.663; no coverage phase 0.679. UW-TIG minus Alamdari is +0.012 (CI +0.001 to +0.022, 6 of 10 seeds) and minus Rückin +0.025 (CI −0.002 to +0.055, 4 of 10): a small, borderline lead over Alamdari and not significant over Rückin. 31-wall yard: Alamdari 0.928 at 570 m; UW-TIG 0.921 (0.908 to 0.933) at 481 m; GATSBI 0.917 at 471 m; Rückin 0.906 at 846 m; random 0.827 at 2,396 m; Bircher 0.664; no coverage phase 0.658; Isler 0.474. UW-TIG is level with Alamdari (−0.007, CI −0.014 to 0.000) and GATSBI (+0.004, −0.005 to +0.013) and ahead of Rückin by +0.014 (+0.001 to +0.029) with 43% less flight. In both yards the no-uncertainty and no-growth variants differ from UW-TIG by 0.002 or less.</w:t>
       </w:r>
     </w:p>
     <w:p>
@@ -55579,7 +55579,7 @@
         <w:ind w:left="723" w:hanging="604"/>
       </w:pPr>
       <w:bookmarkStart w:id="106" w:name="6.11._Threats_to_Validity"/>
-      <w:bookmarkStart w:id="107" w:name="_Toc244268293"/>
+      <w:bookmarkStart w:id="107" w:name="_Toc244356192"/>
       <w:bookmarkEnd w:id="106"/>
       <w:r>
         <w:t>Threats</w:t>
@@ -55648,7 +55648,7 @@
           <w:bCs/>
           <w:sz w:val="24"/>
         </w:rPr>
-        <w:t>Ten seeds were run on the 9-wall yard and five on the 31-wall yard. That is enough to see the coverage effect, but it still does not separate UW-TIG from Alamdari or Rückin significantly.</w:t>
+        <w:t>Ten seeds were run in each yard. That is enough to see the coverage effect, but UW-TIG is only level with the best rivals (Alamdari in both yards, GATSBI at 31 walls) and is not significantly ahead of Rückin in the 9-wall yard.</w:t>
       </w:r>
     </w:p>
     <w:p>
@@ -55736,6 +55736,7 @@
           <w:bCs/>
           <w:sz w:val="24"/>
         </w:rPr>
+        <w:lastRenderedPageBreak/>
         <w:t xml:space="preserve">Class mapping: 31-wall yard with the same flat-quad walls, the same reporting rule (tuned on the small yard), and a budget of 50 chosen from one pilot run, not tuned, with the 31-wall and 9-wall numbers differing in their layouts as well as size, because defect placement is random per seed. Dependent on the dacl10k-to-MBDD2025 class mapping, the dacl10k scores are a judgement (Section 3.3). </w:t>
       </w:r>
     </w:p>
@@ -55792,7 +55793,7 @@
         <w:jc w:val="left"/>
       </w:pPr>
       <w:bookmarkStart w:id="108" w:name="7._FUTURE_SCOPE_AND_ENHANCEMENTS"/>
-      <w:bookmarkStart w:id="109" w:name="_Toc244268294"/>
+      <w:bookmarkStart w:id="109" w:name="_Toc244356193"/>
       <w:bookmarkEnd w:id="108"/>
       <w:r>
         <w:t>FUTURE</w:t>
@@ -56125,7 +56126,7 @@
         <w:jc w:val="left"/>
       </w:pPr>
       <w:bookmarkStart w:id="110" w:name="8._CONCLUSION"/>
-      <w:bookmarkStart w:id="111" w:name="_Toc244268295"/>
+      <w:bookmarkStart w:id="111" w:name="_Toc244356194"/>
       <w:bookmarkEnd w:id="110"/>
       <w:r>
         <w:rPr>
@@ -56501,7 +56502,7 @@
         <w:ind w:left="3199" w:firstLine="0"/>
       </w:pPr>
       <w:bookmarkStart w:id="112" w:name="BIBLIOGRAPHY"/>
-      <w:bookmarkStart w:id="113" w:name="_Toc244268296"/>
+      <w:bookmarkStart w:id="113" w:name="_Toc244356195"/>
       <w:bookmarkEnd w:id="112"/>
       <w:r>
         <w:rPr>

</xml_diff>